<commit_message>
Alterando limitações e conclusões do documento
</commit_message>
<xml_diff>
--- a/docs/Relatorio_NetLab_Charles_Mendes.docx
+++ b/docs/Relatorio_NetLab_Charles_Mendes.docx
@@ -6207,924 +6207,12 @@
     </w:p>
     <w:p>
       <w:r>
-        <w:t xml:space="preserve">A </w:t>
-      </w:r>
-      <w:proofErr w:type="spellStart"/>
-      <w:r>
-        <w:t>pesquisa</w:t>
-      </w:r>
-      <w:proofErr w:type="spellEnd"/>
-      <w:r>
-        <w:t xml:space="preserve"> é </w:t>
-      </w:r>
-      <w:proofErr w:type="spellStart"/>
-      <w:r>
-        <w:t>exploratória</w:t>
-      </w:r>
-      <w:proofErr w:type="spellEnd"/>
-      <w:r>
-        <w:t xml:space="preserve"> e se </w:t>
-      </w:r>
-      <w:proofErr w:type="spellStart"/>
-      <w:r>
-        <w:t>limita</w:t>
-      </w:r>
-      <w:proofErr w:type="spellEnd"/>
-      <w:r>
-        <w:t xml:space="preserve"> </w:t>
-      </w:r>
-      <w:proofErr w:type="spellStart"/>
-      <w:r>
-        <w:t>às</w:t>
-      </w:r>
-      <w:proofErr w:type="spellEnd"/>
-      <w:r>
-        <w:t xml:space="preserve"> </w:t>
-      </w:r>
-      <w:proofErr w:type="spellStart"/>
-      <w:r>
-        <w:t>ementas</w:t>
-      </w:r>
-      <w:proofErr w:type="spellEnd"/>
-      <w:r>
-        <w:t xml:space="preserve"> e </w:t>
-      </w:r>
-      <w:proofErr w:type="spellStart"/>
-      <w:r>
-        <w:t>aos</w:t>
-      </w:r>
-      <w:proofErr w:type="spellEnd"/>
-      <w:r>
-        <w:t xml:space="preserve"> </w:t>
-      </w:r>
-      <w:proofErr w:type="spellStart"/>
-      <w:r>
-        <w:t>candidatos</w:t>
-      </w:r>
-      <w:proofErr w:type="spellEnd"/>
-      <w:r>
-        <w:t xml:space="preserve"> </w:t>
-      </w:r>
-      <w:proofErr w:type="spellStart"/>
-      <w:r>
-        <w:t>encontrados</w:t>
-      </w:r>
-      <w:proofErr w:type="spellEnd"/>
-      <w:r>
-        <w:t xml:space="preserve"> </w:t>
-      </w:r>
-      <w:proofErr w:type="spellStart"/>
-      <w:r>
-        <w:t>pelo</w:t>
-      </w:r>
-      <w:proofErr w:type="spellEnd"/>
-      <w:r>
-        <w:t xml:space="preserve"> </w:t>
-      </w:r>
-      <w:proofErr w:type="spellStart"/>
-      <w:r>
-        <w:t>filtro</w:t>
-      </w:r>
-      <w:proofErr w:type="spellEnd"/>
-      <w:r>
-        <w:t xml:space="preserve">. As </w:t>
-      </w:r>
-      <w:proofErr w:type="spellStart"/>
-      <w:r>
-        <w:t>palavras-chave</w:t>
-      </w:r>
-      <w:proofErr w:type="spellEnd"/>
-      <w:r>
-        <w:t xml:space="preserve"> </w:t>
-      </w:r>
-      <w:proofErr w:type="spellStart"/>
-      <w:r>
-        <w:t>podem</w:t>
-      </w:r>
-      <w:proofErr w:type="spellEnd"/>
-      <w:r>
-        <w:t xml:space="preserve"> </w:t>
-      </w:r>
-      <w:proofErr w:type="spellStart"/>
-      <w:r>
-        <w:t>incluir</w:t>
-      </w:r>
-      <w:proofErr w:type="spellEnd"/>
-      <w:r>
-        <w:t xml:space="preserve"> </w:t>
-      </w:r>
-      <w:proofErr w:type="spellStart"/>
-      <w:r>
-        <w:t>falsos</w:t>
-      </w:r>
-      <w:proofErr w:type="spellEnd"/>
-      <w:r>
-        <w:t xml:space="preserve"> </w:t>
-      </w:r>
-      <w:proofErr w:type="spellStart"/>
-      <w:r>
-        <w:t>positivos</w:t>
-      </w:r>
-      <w:proofErr w:type="spellEnd"/>
-      <w:r>
-        <w:t xml:space="preserve"> </w:t>
-      </w:r>
-      <w:proofErr w:type="spellStart"/>
-      <w:r>
-        <w:t>ou</w:t>
-      </w:r>
-      <w:proofErr w:type="spellEnd"/>
-      <w:r>
-        <w:t xml:space="preserve"> </w:t>
-      </w:r>
-      <w:proofErr w:type="spellStart"/>
-      <w:r>
-        <w:t>deixar</w:t>
-      </w:r>
-      <w:proofErr w:type="spellEnd"/>
-      <w:r>
-        <w:t xml:space="preserve"> de </w:t>
-      </w:r>
-      <w:proofErr w:type="spellStart"/>
-      <w:r>
-        <w:t>recuperar</w:t>
-      </w:r>
-      <w:proofErr w:type="spellEnd"/>
-      <w:r>
-        <w:t xml:space="preserve"> </w:t>
-      </w:r>
-      <w:proofErr w:type="spellStart"/>
-      <w:r>
-        <w:t>proposições</w:t>
-      </w:r>
-      <w:proofErr w:type="spellEnd"/>
-      <w:r>
-        <w:t xml:space="preserve"> </w:t>
-      </w:r>
-      <w:proofErr w:type="spellStart"/>
-      <w:r>
-        <w:t>relevantes</w:t>
-      </w:r>
-      <w:proofErr w:type="spellEnd"/>
-      <w:r>
-        <w:t xml:space="preserve"> com </w:t>
-      </w:r>
-      <w:proofErr w:type="spellStart"/>
-      <w:r>
-        <w:t>outras</w:t>
-      </w:r>
-      <w:proofErr w:type="spellEnd"/>
-      <w:r>
-        <w:t xml:space="preserve"> </w:t>
-      </w:r>
-      <w:proofErr w:type="spellStart"/>
-      <w:r>
-        <w:t>expressões</w:t>
-      </w:r>
-      <w:proofErr w:type="spellEnd"/>
-      <w:r>
-        <w:t xml:space="preserve">. O TF-IDF </w:t>
-      </w:r>
-      <w:proofErr w:type="spellStart"/>
-      <w:r>
-        <w:t>considera</w:t>
-      </w:r>
-      <w:proofErr w:type="spellEnd"/>
-      <w:r>
-        <w:t xml:space="preserve"> </w:t>
-      </w:r>
-      <w:proofErr w:type="spellStart"/>
-      <w:r>
-        <w:t>apenas</w:t>
-      </w:r>
-      <w:proofErr w:type="spellEnd"/>
-      <w:r>
-        <w:t xml:space="preserve"> um </w:t>
-      </w:r>
-      <w:proofErr w:type="spellStart"/>
-      <w:r>
-        <w:t>vocabulário</w:t>
-      </w:r>
-      <w:proofErr w:type="spellEnd"/>
-      <w:r>
-        <w:t xml:space="preserve"> </w:t>
-      </w:r>
-      <w:proofErr w:type="spellStart"/>
-      <w:r>
-        <w:t>predefinido</w:t>
-      </w:r>
-      <w:proofErr w:type="spellEnd"/>
-      <w:r>
-        <w:t xml:space="preserve">, com </w:t>
-      </w:r>
-      <w:proofErr w:type="spellStart"/>
-      <w:r>
-        <w:t>expressões</w:t>
-      </w:r>
-      <w:proofErr w:type="spellEnd"/>
-      <w:r>
-        <w:t xml:space="preserve"> de </w:t>
-      </w:r>
-      <w:proofErr w:type="spellStart"/>
-      <w:r>
-        <w:t>até</w:t>
-      </w:r>
-      <w:proofErr w:type="spellEnd"/>
-      <w:r>
-        <w:t xml:space="preserve"> </w:t>
-      </w:r>
-      <w:proofErr w:type="spellStart"/>
-      <w:r>
-        <w:t>três</w:t>
-      </w:r>
-      <w:proofErr w:type="spellEnd"/>
-      <w:r>
-        <w:t xml:space="preserve"> </w:t>
-      </w:r>
-      <w:proofErr w:type="spellStart"/>
-      <w:r>
-        <w:t>palavras</w:t>
-      </w:r>
-      <w:proofErr w:type="spellEnd"/>
-      <w:r>
-        <w:t xml:space="preserve">, </w:t>
-      </w:r>
-      <w:proofErr w:type="spellStart"/>
-      <w:r>
-        <w:t>incluindo</w:t>
-      </w:r>
-      <w:proofErr w:type="spellEnd"/>
-      <w:r>
-        <w:t xml:space="preserve"> </w:t>
-      </w:r>
-      <w:proofErr w:type="spellStart"/>
-      <w:r>
-        <w:t>infraestrutura</w:t>
-      </w:r>
-      <w:proofErr w:type="spellEnd"/>
-      <w:r>
-        <w:t xml:space="preserve"> digital e </w:t>
-      </w:r>
-      <w:proofErr w:type="spellStart"/>
-      <w:r>
-        <w:t>computação</w:t>
-      </w:r>
-      <w:proofErr w:type="spellEnd"/>
-      <w:r>
-        <w:t xml:space="preserve"> </w:t>
-      </w:r>
-      <w:proofErr w:type="spellStart"/>
-      <w:r>
-        <w:t>em</w:t>
-      </w:r>
-      <w:proofErr w:type="spellEnd"/>
-      <w:r>
-        <w:t xml:space="preserve"> </w:t>
-      </w:r>
-      <w:proofErr w:type="spellStart"/>
-      <w:r>
-        <w:t>nuvem</w:t>
-      </w:r>
-      <w:proofErr w:type="spellEnd"/>
-      <w:r>
-        <w:t xml:space="preserve">. </w:t>
-      </w:r>
-      <w:proofErr w:type="gramStart"/>
-      <w:r>
-        <w:t>Seus</w:t>
-      </w:r>
-      <w:proofErr w:type="gramEnd"/>
-      <w:r>
-        <w:t xml:space="preserve"> pesos </w:t>
-      </w:r>
-      <w:proofErr w:type="spellStart"/>
-      <w:r>
-        <w:t>descrevem</w:t>
-      </w:r>
-      <w:proofErr w:type="spellEnd"/>
-      <w:r>
-        <w:t xml:space="preserve"> o </w:t>
-      </w:r>
-      <w:proofErr w:type="spellStart"/>
-      <w:r>
-        <w:t>vocabulário</w:t>
-      </w:r>
-      <w:proofErr w:type="spellEnd"/>
-      <w:r>
-        <w:t xml:space="preserve"> dos </w:t>
-      </w:r>
-      <w:proofErr w:type="spellStart"/>
-      <w:r>
-        <w:t>textos</w:t>
-      </w:r>
-      <w:proofErr w:type="spellEnd"/>
-      <w:r>
-        <w:t xml:space="preserve"> </w:t>
-      </w:r>
-      <w:proofErr w:type="spellStart"/>
-      <w:r>
-        <w:t>selecionados</w:t>
-      </w:r>
-      <w:proofErr w:type="spellEnd"/>
-      <w:r>
-        <w:t xml:space="preserve">, </w:t>
-      </w:r>
-      <w:proofErr w:type="spellStart"/>
-      <w:r>
-        <w:t>não</w:t>
-      </w:r>
-      <w:proofErr w:type="spellEnd"/>
-      <w:r>
-        <w:t xml:space="preserve"> </w:t>
-      </w:r>
-      <w:proofErr w:type="gramStart"/>
-      <w:r>
-        <w:t>a</w:t>
-      </w:r>
-      <w:proofErr w:type="gramEnd"/>
-      <w:r>
-        <w:t xml:space="preserve"> </w:t>
-      </w:r>
-      <w:proofErr w:type="spellStart"/>
-      <w:r>
-        <w:t>intensidade</w:t>
-      </w:r>
-      <w:proofErr w:type="spellEnd"/>
-      <w:r>
-        <w:t xml:space="preserve"> dos </w:t>
-      </w:r>
-      <w:proofErr w:type="spellStart"/>
-      <w:r>
-        <w:t>impactos</w:t>
-      </w:r>
-      <w:proofErr w:type="spellEnd"/>
-      <w:r>
-        <w:t xml:space="preserve"> </w:t>
-      </w:r>
-      <w:proofErr w:type="spellStart"/>
-      <w:r>
-        <w:t>ambientais</w:t>
-      </w:r>
-      <w:proofErr w:type="spellEnd"/>
-      <w:r>
-        <w:t xml:space="preserve">. A </w:t>
-      </w:r>
-      <w:proofErr w:type="spellStart"/>
-      <w:r>
-        <w:t>correspondência</w:t>
-      </w:r>
-      <w:proofErr w:type="spellEnd"/>
-      <w:r>
-        <w:t xml:space="preserve"> dos </w:t>
-      </w:r>
-      <w:proofErr w:type="spellStart"/>
-      <w:r>
-        <w:t>termos</w:t>
-      </w:r>
-      <w:proofErr w:type="spellEnd"/>
-      <w:r>
-        <w:t xml:space="preserve"> </w:t>
-      </w:r>
-      <w:proofErr w:type="spellStart"/>
-      <w:r>
-        <w:t>também</w:t>
-      </w:r>
-      <w:proofErr w:type="spellEnd"/>
-      <w:r>
-        <w:t xml:space="preserve"> </w:t>
-      </w:r>
-      <w:proofErr w:type="spellStart"/>
-      <w:r>
-        <w:t>depende</w:t>
-      </w:r>
-      <w:proofErr w:type="spellEnd"/>
-      <w:r>
-        <w:t xml:space="preserve"> da forma </w:t>
-      </w:r>
-      <w:proofErr w:type="spellStart"/>
-      <w:r>
-        <w:t>escrita</w:t>
-      </w:r>
-      <w:proofErr w:type="spellEnd"/>
-      <w:r>
-        <w:t xml:space="preserve">: data center </w:t>
-      </w:r>
-      <w:proofErr w:type="spellStart"/>
-      <w:r>
-        <w:t>está</w:t>
-      </w:r>
-      <w:proofErr w:type="spellEnd"/>
-      <w:r>
-        <w:t xml:space="preserve"> no </w:t>
-      </w:r>
-      <w:proofErr w:type="spellStart"/>
-      <w:r>
-        <w:t>vocabulário</w:t>
-      </w:r>
-      <w:proofErr w:type="spellEnd"/>
-      <w:r>
-        <w:t xml:space="preserve">, mas a forma plural data centers </w:t>
-      </w:r>
-      <w:proofErr w:type="spellStart"/>
-      <w:r>
-        <w:t>não</w:t>
-      </w:r>
-      <w:proofErr w:type="spellEnd"/>
-      <w:r>
-        <w:t xml:space="preserve"> </w:t>
-      </w:r>
-      <w:proofErr w:type="spellStart"/>
-      <w:r>
-        <w:t>recebe</w:t>
-      </w:r>
-      <w:proofErr w:type="spellEnd"/>
-      <w:r>
-        <w:t xml:space="preserve"> o peso dessa </w:t>
-      </w:r>
-      <w:proofErr w:type="spellStart"/>
-      <w:r>
-        <w:t>expressão</w:t>
-      </w:r>
-      <w:proofErr w:type="spellEnd"/>
-      <w:r>
-        <w:t>.</w:t>
+        <w:t>A pesquisa analisou apenas os resumos das propostas, chamados ementas. A busca por palavras-chave pode deixar propostas importantes de fora ou incluir textos sem relação com o tema, como o caso de marca d’água. Por isso, as cinco propostas selecionadas não representam todo o debate na Câmara.</w:t>
       </w:r>
     </w:p>
     <w:p>
       <w:r>
-        <w:t xml:space="preserve">A </w:t>
-      </w:r>
-      <w:proofErr w:type="spellStart"/>
-      <w:r>
-        <w:t>presença</w:t>
-      </w:r>
-      <w:proofErr w:type="spellEnd"/>
-      <w:r>
-        <w:t xml:space="preserve"> literal das </w:t>
-      </w:r>
-      <w:proofErr w:type="spellStart"/>
-      <w:r>
-        <w:t>evidências</w:t>
-      </w:r>
-      <w:proofErr w:type="spellEnd"/>
-      <w:r>
-        <w:t xml:space="preserve"> </w:t>
-      </w:r>
-      <w:proofErr w:type="spellStart"/>
-      <w:r>
-        <w:t>permite</w:t>
-      </w:r>
-      <w:proofErr w:type="spellEnd"/>
-      <w:r>
-        <w:t xml:space="preserve"> </w:t>
-      </w:r>
-      <w:proofErr w:type="spellStart"/>
-      <w:r>
-        <w:t>conferir</w:t>
-      </w:r>
-      <w:proofErr w:type="spellEnd"/>
-      <w:r>
-        <w:t xml:space="preserve"> </w:t>
-      </w:r>
-      <w:proofErr w:type="gramStart"/>
-      <w:r>
-        <w:t>a</w:t>
-      </w:r>
-      <w:proofErr w:type="gramEnd"/>
-      <w:r>
-        <w:t xml:space="preserve"> </w:t>
-      </w:r>
-      <w:proofErr w:type="spellStart"/>
-      <w:r>
-        <w:t>origem</w:t>
-      </w:r>
-      <w:proofErr w:type="spellEnd"/>
-      <w:r>
-        <w:t xml:space="preserve"> dos </w:t>
-      </w:r>
-      <w:proofErr w:type="spellStart"/>
-      <w:r>
-        <w:t>trechos</w:t>
-      </w:r>
-      <w:proofErr w:type="spellEnd"/>
-      <w:r>
-        <w:t xml:space="preserve">, mas </w:t>
-      </w:r>
-      <w:proofErr w:type="spellStart"/>
-      <w:r>
-        <w:t>não</w:t>
-      </w:r>
-      <w:proofErr w:type="spellEnd"/>
-      <w:r>
-        <w:t xml:space="preserve"> </w:t>
-      </w:r>
-      <w:proofErr w:type="spellStart"/>
-      <w:r>
-        <w:t>comprova</w:t>
-      </w:r>
-      <w:proofErr w:type="spellEnd"/>
-      <w:r>
-        <w:t xml:space="preserve"> a </w:t>
-      </w:r>
-      <w:proofErr w:type="spellStart"/>
-      <w:r>
-        <w:t>correção</w:t>
-      </w:r>
-      <w:proofErr w:type="spellEnd"/>
-      <w:r>
-        <w:t xml:space="preserve"> dos </w:t>
-      </w:r>
-      <w:proofErr w:type="spellStart"/>
-      <w:r>
-        <w:t>temas</w:t>
-      </w:r>
-      <w:proofErr w:type="spellEnd"/>
-      <w:r>
-        <w:t xml:space="preserve"> </w:t>
-      </w:r>
-      <w:proofErr w:type="spellStart"/>
-      <w:r>
-        <w:t>ou</w:t>
-      </w:r>
-      <w:proofErr w:type="spellEnd"/>
-      <w:r>
-        <w:t xml:space="preserve"> </w:t>
-      </w:r>
-      <w:proofErr w:type="spellStart"/>
-      <w:r>
-        <w:t>classificações</w:t>
-      </w:r>
-      <w:proofErr w:type="spellEnd"/>
-      <w:r>
-        <w:t xml:space="preserve">. A </w:t>
-      </w:r>
-      <w:proofErr w:type="spellStart"/>
-      <w:r>
-        <w:t>concordância</w:t>
-      </w:r>
-      <w:proofErr w:type="spellEnd"/>
-      <w:r>
-        <w:t xml:space="preserve"> entre duas </w:t>
-      </w:r>
-      <w:proofErr w:type="spellStart"/>
-      <w:r>
-        <w:t>avaliações</w:t>
-      </w:r>
-      <w:proofErr w:type="spellEnd"/>
-      <w:r>
-        <w:t xml:space="preserve"> do </w:t>
-      </w:r>
-      <w:proofErr w:type="spellStart"/>
-      <w:r>
-        <w:t>mesmo</w:t>
-      </w:r>
-      <w:proofErr w:type="spellEnd"/>
-      <w:r>
-        <w:t xml:space="preserve"> </w:t>
-      </w:r>
-      <w:proofErr w:type="spellStart"/>
-      <w:r>
-        <w:t>modelo</w:t>
-      </w:r>
-      <w:proofErr w:type="spellEnd"/>
-      <w:r>
-        <w:t xml:space="preserve"> </w:t>
-      </w:r>
-      <w:proofErr w:type="spellStart"/>
-      <w:r>
-        <w:t>também</w:t>
-      </w:r>
-      <w:proofErr w:type="spellEnd"/>
-      <w:r>
-        <w:t xml:space="preserve"> </w:t>
-      </w:r>
-      <w:proofErr w:type="spellStart"/>
-      <w:r>
-        <w:t>pode</w:t>
-      </w:r>
-      <w:proofErr w:type="spellEnd"/>
-      <w:r>
-        <w:t xml:space="preserve"> </w:t>
-      </w:r>
-      <w:proofErr w:type="spellStart"/>
-      <w:r>
-        <w:t>repetir</w:t>
-      </w:r>
-      <w:proofErr w:type="spellEnd"/>
-      <w:r>
-        <w:t xml:space="preserve"> </w:t>
-      </w:r>
-      <w:proofErr w:type="spellStart"/>
-      <w:r>
-        <w:t>interpretações</w:t>
-      </w:r>
-      <w:proofErr w:type="spellEnd"/>
-      <w:r>
-        <w:t xml:space="preserve"> </w:t>
-      </w:r>
-      <w:proofErr w:type="spellStart"/>
-      <w:r>
-        <w:t>sem</w:t>
-      </w:r>
-      <w:proofErr w:type="spellEnd"/>
-      <w:r>
-        <w:t xml:space="preserve"> </w:t>
-      </w:r>
-      <w:proofErr w:type="spellStart"/>
-      <w:r>
-        <w:t>apoio</w:t>
-      </w:r>
-      <w:proofErr w:type="spellEnd"/>
-      <w:r>
-        <w:t xml:space="preserve"> </w:t>
-      </w:r>
-      <w:proofErr w:type="spellStart"/>
-      <w:r>
-        <w:t>explícito</w:t>
-      </w:r>
-      <w:proofErr w:type="spellEnd"/>
-      <w:r>
-        <w:t xml:space="preserve"> no </w:t>
-      </w:r>
-      <w:proofErr w:type="spellStart"/>
-      <w:r>
-        <w:t>texto</w:t>
-      </w:r>
-      <w:proofErr w:type="spellEnd"/>
-      <w:r>
-        <w:t xml:space="preserve">: o </w:t>
-      </w:r>
-      <w:proofErr w:type="spellStart"/>
-      <w:r>
-        <w:t>tema</w:t>
-      </w:r>
-      <w:proofErr w:type="spellEnd"/>
-      <w:r>
-        <w:t xml:space="preserve"> Energia </w:t>
-      </w:r>
-      <w:proofErr w:type="spellStart"/>
-      <w:r>
-        <w:t>foi</w:t>
-      </w:r>
-      <w:proofErr w:type="spellEnd"/>
-      <w:r>
-        <w:t xml:space="preserve"> </w:t>
-      </w:r>
-      <w:proofErr w:type="spellStart"/>
-      <w:r>
-        <w:t>atribuído</w:t>
-      </w:r>
-      <w:proofErr w:type="spellEnd"/>
-      <w:r>
-        <w:t xml:space="preserve"> </w:t>
-      </w:r>
-      <w:proofErr w:type="spellStart"/>
-      <w:r>
-        <w:t>ao</w:t>
-      </w:r>
-      <w:proofErr w:type="spellEnd"/>
-      <w:r>
-        <w:t xml:space="preserve"> PLP 280/2025 </w:t>
-      </w:r>
-      <w:proofErr w:type="spellStart"/>
-      <w:r>
-        <w:t>nas</w:t>
-      </w:r>
-      <w:proofErr w:type="spellEnd"/>
-      <w:r>
-        <w:t xml:space="preserve"> duas </w:t>
-      </w:r>
-      <w:proofErr w:type="spellStart"/>
-      <w:r>
-        <w:t>avaliações</w:t>
-      </w:r>
-      <w:proofErr w:type="spellEnd"/>
-      <w:r>
-        <w:t xml:space="preserve">, </w:t>
-      </w:r>
-      <w:proofErr w:type="spellStart"/>
-      <w:r>
-        <w:t>embora</w:t>
-      </w:r>
-      <w:proofErr w:type="spellEnd"/>
-      <w:r>
-        <w:t xml:space="preserve"> </w:t>
-      </w:r>
-      <w:proofErr w:type="spellStart"/>
-      <w:r>
-        <w:t>sua</w:t>
-      </w:r>
-      <w:proofErr w:type="spellEnd"/>
-      <w:r>
-        <w:t xml:space="preserve"> </w:t>
-      </w:r>
-      <w:proofErr w:type="spellStart"/>
-      <w:r>
-        <w:t>ementa</w:t>
-      </w:r>
-      <w:proofErr w:type="spellEnd"/>
-      <w:r>
-        <w:t xml:space="preserve"> </w:t>
-      </w:r>
-      <w:proofErr w:type="spellStart"/>
-      <w:r>
-        <w:t>mencione</w:t>
-      </w:r>
-      <w:proofErr w:type="spellEnd"/>
-      <w:r>
-        <w:t xml:space="preserve"> </w:t>
-      </w:r>
-      <w:proofErr w:type="spellStart"/>
-      <w:r>
-        <w:t>licenciamento</w:t>
-      </w:r>
-      <w:proofErr w:type="spellEnd"/>
-      <w:r>
-        <w:t xml:space="preserve"> </w:t>
-      </w:r>
-      <w:proofErr w:type="spellStart"/>
-      <w:r>
-        <w:t>ambiental</w:t>
-      </w:r>
-      <w:proofErr w:type="spellEnd"/>
-      <w:r>
-        <w:t xml:space="preserve">, </w:t>
-      </w:r>
-      <w:proofErr w:type="spellStart"/>
-      <w:r>
-        <w:t>sem</w:t>
-      </w:r>
-      <w:proofErr w:type="spellEnd"/>
-      <w:r>
-        <w:t xml:space="preserve"> </w:t>
-      </w:r>
-      <w:proofErr w:type="spellStart"/>
-      <w:r>
-        <w:t>referência</w:t>
-      </w:r>
-      <w:proofErr w:type="spellEnd"/>
-      <w:r>
-        <w:t xml:space="preserve"> </w:t>
-      </w:r>
-      <w:proofErr w:type="spellStart"/>
-      <w:r>
-        <w:t>específica</w:t>
-      </w:r>
-      <w:proofErr w:type="spellEnd"/>
-      <w:r>
-        <w:t xml:space="preserve"> à </w:t>
-      </w:r>
-      <w:proofErr w:type="spellStart"/>
-      <w:r>
-        <w:t>energia</w:t>
-      </w:r>
-      <w:proofErr w:type="spellEnd"/>
-      <w:r>
-        <w:t xml:space="preserve">. </w:t>
-      </w:r>
-      <w:proofErr w:type="spellStart"/>
-      <w:r>
-        <w:t>Os</w:t>
-      </w:r>
-      <w:proofErr w:type="spellEnd"/>
-      <w:r>
-        <w:t xml:space="preserve"> </w:t>
-      </w:r>
-      <w:proofErr w:type="spellStart"/>
-      <w:r>
-        <w:t>resultados</w:t>
-      </w:r>
-      <w:proofErr w:type="spellEnd"/>
-      <w:r>
-        <w:t xml:space="preserve"> </w:t>
-      </w:r>
-      <w:proofErr w:type="spellStart"/>
-      <w:r>
-        <w:t>não</w:t>
-      </w:r>
-      <w:proofErr w:type="spellEnd"/>
-      <w:r>
-        <w:t xml:space="preserve"> </w:t>
-      </w:r>
-      <w:proofErr w:type="spellStart"/>
-      <w:r>
-        <w:t>medem</w:t>
-      </w:r>
-      <w:proofErr w:type="spellEnd"/>
-      <w:r>
-        <w:t xml:space="preserve"> </w:t>
-      </w:r>
-      <w:proofErr w:type="spellStart"/>
-      <w:r>
-        <w:t>impactos</w:t>
-      </w:r>
-      <w:proofErr w:type="spellEnd"/>
-      <w:r>
-        <w:t xml:space="preserve"> </w:t>
-      </w:r>
-      <w:proofErr w:type="spellStart"/>
-      <w:r>
-        <w:t>ambientais</w:t>
-      </w:r>
-      <w:proofErr w:type="spellEnd"/>
-      <w:r>
-        <w:t xml:space="preserve"> reais, </w:t>
-      </w:r>
-      <w:proofErr w:type="spellStart"/>
-      <w:r>
-        <w:t>não</w:t>
-      </w:r>
-      <w:proofErr w:type="spellEnd"/>
-      <w:r>
-        <w:t xml:space="preserve"> </w:t>
-      </w:r>
-      <w:proofErr w:type="spellStart"/>
-      <w:r>
-        <w:t>substituem</w:t>
-      </w:r>
-      <w:proofErr w:type="spellEnd"/>
-      <w:r>
-        <w:t xml:space="preserve"> a </w:t>
-      </w:r>
-      <w:proofErr w:type="spellStart"/>
-      <w:r>
-        <w:t>leitura</w:t>
-      </w:r>
-      <w:proofErr w:type="spellEnd"/>
-      <w:r>
-        <w:t xml:space="preserve"> do </w:t>
-      </w:r>
-      <w:proofErr w:type="spellStart"/>
-      <w:r>
-        <w:t>inteiro</w:t>
-      </w:r>
-      <w:proofErr w:type="spellEnd"/>
-      <w:r>
-        <w:t xml:space="preserve"> </w:t>
-      </w:r>
-      <w:proofErr w:type="spellStart"/>
-      <w:r>
-        <w:t>teor</w:t>
-      </w:r>
-      <w:proofErr w:type="spellEnd"/>
-      <w:r>
-        <w:t xml:space="preserve"> e </w:t>
-      </w:r>
-      <w:proofErr w:type="spellStart"/>
-      <w:r>
-        <w:t>não</w:t>
-      </w:r>
-      <w:proofErr w:type="spellEnd"/>
-      <w:r>
-        <w:t xml:space="preserve"> </w:t>
-      </w:r>
-      <w:proofErr w:type="spellStart"/>
-      <w:r>
-        <w:t>representam</w:t>
-      </w:r>
-      <w:proofErr w:type="spellEnd"/>
-      <w:r>
-        <w:t xml:space="preserve"> um </w:t>
-      </w:r>
-      <w:proofErr w:type="spellStart"/>
-      <w:r>
-        <w:t>levantamento</w:t>
-      </w:r>
-      <w:proofErr w:type="spellEnd"/>
-      <w:r>
-        <w:t xml:space="preserve"> </w:t>
-      </w:r>
-      <w:proofErr w:type="spellStart"/>
-      <w:r>
-        <w:t>exaustivo</w:t>
-      </w:r>
-      <w:proofErr w:type="spellEnd"/>
-      <w:r>
-        <w:t xml:space="preserve"> da </w:t>
-      </w:r>
-      <w:proofErr w:type="spellStart"/>
-      <w:r>
-        <w:t>legislação</w:t>
-      </w:r>
-      <w:proofErr w:type="spellEnd"/>
-      <w:r>
-        <w:t xml:space="preserve"> </w:t>
-      </w:r>
-      <w:proofErr w:type="spellStart"/>
-      <w:r>
-        <w:t>sobre</w:t>
-      </w:r>
-      <w:proofErr w:type="spellEnd"/>
-      <w:r>
-        <w:t xml:space="preserve"> IA e </w:t>
-      </w:r>
-      <w:proofErr w:type="spellStart"/>
-      <w:r>
-        <w:t>ambiente</w:t>
-      </w:r>
-      <w:proofErr w:type="spellEnd"/>
-      <w:r>
-        <w:t>.</w:t>
+        <w:t>O TF-IDF destaca apenas os termos escolhidos para a análise e pode não reconhecer variações das palavras. O GPT também pode errar, mesmo quando as duas avaliações concordam. Os resultados mostram o que aparece nas ementas; não indicam se as propostas foram aprovadas nem quais efeitos teriam no meio ambiente.</w:t>
       </w:r>
     </w:p>
     <w:p>
@@ -7139,621 +6227,8 @@
       <w:proofErr w:type="spellEnd"/>
     </w:p>
     <w:p>
-      <w:proofErr w:type="spellStart"/>
-      <w:r>
-        <w:t>Os</w:t>
-      </w:r>
-      <w:proofErr w:type="spellEnd"/>
-      <w:r>
-        <w:t xml:space="preserve"> </w:t>
-      </w:r>
-      <w:proofErr w:type="spellStart"/>
-      <w:r>
-        <w:t>resultados</w:t>
-      </w:r>
-      <w:proofErr w:type="spellEnd"/>
-      <w:r>
-        <w:t xml:space="preserve"> </w:t>
-      </w:r>
-      <w:proofErr w:type="spellStart"/>
-      <w:r>
-        <w:t>indicam</w:t>
-      </w:r>
-      <w:proofErr w:type="spellEnd"/>
-      <w:r>
-        <w:t xml:space="preserve"> </w:t>
-      </w:r>
-      <w:proofErr w:type="spellStart"/>
-      <w:r>
-        <w:t>que</w:t>
-      </w:r>
-      <w:proofErr w:type="spellEnd"/>
-      <w:r>
-        <w:t xml:space="preserve">, </w:t>
-      </w:r>
-      <w:proofErr w:type="spellStart"/>
-      <w:r>
-        <w:t>nas</w:t>
-      </w:r>
-      <w:proofErr w:type="spellEnd"/>
-      <w:r>
-        <w:t xml:space="preserve"> </w:t>
-      </w:r>
-      <w:proofErr w:type="spellStart"/>
-      <w:r>
-        <w:t>cinco</w:t>
-      </w:r>
-      <w:proofErr w:type="spellEnd"/>
-      <w:r>
-        <w:t xml:space="preserve"> </w:t>
-      </w:r>
-      <w:proofErr w:type="spellStart"/>
-      <w:r>
-        <w:t>ementas</w:t>
-      </w:r>
-      <w:proofErr w:type="spellEnd"/>
-      <w:r>
-        <w:t xml:space="preserve"> </w:t>
-      </w:r>
-      <w:proofErr w:type="spellStart"/>
-      <w:r>
-        <w:t>selecionadas</w:t>
-      </w:r>
-      <w:proofErr w:type="spellEnd"/>
-      <w:r>
-        <w:t xml:space="preserve">, </w:t>
-      </w:r>
-      <w:proofErr w:type="gramStart"/>
-      <w:r>
-        <w:t>a</w:t>
-      </w:r>
-      <w:proofErr w:type="gramEnd"/>
-      <w:r>
-        <w:t xml:space="preserve"> </w:t>
-      </w:r>
-      <w:proofErr w:type="spellStart"/>
-      <w:r>
-        <w:t>abordagem</w:t>
-      </w:r>
-      <w:proofErr w:type="spellEnd"/>
-      <w:r>
-        <w:t xml:space="preserve"> </w:t>
-      </w:r>
-      <w:proofErr w:type="spellStart"/>
-      <w:r>
-        <w:t>ambiental</w:t>
-      </w:r>
-      <w:proofErr w:type="spellEnd"/>
-      <w:r>
-        <w:t xml:space="preserve"> </w:t>
-      </w:r>
-      <w:proofErr w:type="spellStart"/>
-      <w:r>
-        <w:t>direta</w:t>
-      </w:r>
-      <w:proofErr w:type="spellEnd"/>
-      <w:r>
-        <w:t xml:space="preserve"> se </w:t>
-      </w:r>
-      <w:proofErr w:type="spellStart"/>
-      <w:r>
-        <w:t>concentra</w:t>
-      </w:r>
-      <w:proofErr w:type="spellEnd"/>
-      <w:r>
-        <w:t xml:space="preserve"> </w:t>
-      </w:r>
-      <w:proofErr w:type="spellStart"/>
-      <w:r>
-        <w:t>em</w:t>
-      </w:r>
-      <w:proofErr w:type="spellEnd"/>
-      <w:r>
-        <w:t xml:space="preserve"> </w:t>
-      </w:r>
-      <w:proofErr w:type="spellStart"/>
-      <w:r>
-        <w:t>eficiência</w:t>
-      </w:r>
-      <w:proofErr w:type="spellEnd"/>
-      <w:r>
-        <w:t xml:space="preserve"> </w:t>
-      </w:r>
-      <w:proofErr w:type="spellStart"/>
-      <w:r>
-        <w:t>energética</w:t>
-      </w:r>
-      <w:proofErr w:type="spellEnd"/>
-      <w:r>
-        <w:t xml:space="preserve">, </w:t>
-      </w:r>
-      <w:proofErr w:type="spellStart"/>
-      <w:r>
-        <w:t>sustentabilidade</w:t>
-      </w:r>
-      <w:proofErr w:type="spellEnd"/>
-      <w:r>
-        <w:t xml:space="preserve"> e </w:t>
-      </w:r>
-      <w:proofErr w:type="spellStart"/>
-      <w:r>
-        <w:t>licenciamento</w:t>
-      </w:r>
-      <w:proofErr w:type="spellEnd"/>
-      <w:r>
-        <w:t xml:space="preserve"> de data centers. </w:t>
-      </w:r>
-      <w:proofErr w:type="spellStart"/>
-      <w:r>
-        <w:t>Os</w:t>
-      </w:r>
-      <w:proofErr w:type="spellEnd"/>
-      <w:r>
-        <w:t xml:space="preserve"> </w:t>
-      </w:r>
-      <w:proofErr w:type="spellStart"/>
-      <w:r>
-        <w:t>gráficos</w:t>
-      </w:r>
-      <w:proofErr w:type="spellEnd"/>
-      <w:r>
-        <w:t xml:space="preserve"> </w:t>
-      </w:r>
-      <w:proofErr w:type="spellStart"/>
-      <w:r>
-        <w:t>mostram</w:t>
-      </w:r>
-      <w:proofErr w:type="spellEnd"/>
-      <w:r>
-        <w:t xml:space="preserve"> </w:t>
-      </w:r>
-      <w:proofErr w:type="spellStart"/>
-      <w:r>
-        <w:t>igual</w:t>
-      </w:r>
-      <w:proofErr w:type="spellEnd"/>
-      <w:r>
-        <w:t xml:space="preserve"> </w:t>
-      </w:r>
-      <w:proofErr w:type="spellStart"/>
-      <w:r>
-        <w:t>número</w:t>
-      </w:r>
-      <w:proofErr w:type="spellEnd"/>
-      <w:r>
-        <w:t xml:space="preserve"> de </w:t>
-      </w:r>
-      <w:proofErr w:type="spellStart"/>
-      <w:r>
-        <w:t>relações</w:t>
-      </w:r>
-      <w:proofErr w:type="spellEnd"/>
-      <w:r>
-        <w:t xml:space="preserve"> </w:t>
-      </w:r>
-      <w:proofErr w:type="spellStart"/>
-      <w:r>
-        <w:t>diretas</w:t>
-      </w:r>
-      <w:proofErr w:type="spellEnd"/>
-      <w:r>
-        <w:t xml:space="preserve"> e </w:t>
-      </w:r>
-      <w:proofErr w:type="spellStart"/>
-      <w:r>
-        <w:t>indiretas</w:t>
-      </w:r>
-      <w:proofErr w:type="spellEnd"/>
-      <w:r>
-        <w:t xml:space="preserve">, </w:t>
-      </w:r>
-      <w:proofErr w:type="spellStart"/>
-      <w:r>
-        <w:t>predominância</w:t>
-      </w:r>
-      <w:proofErr w:type="spellEnd"/>
-      <w:r>
-        <w:t xml:space="preserve"> de </w:t>
-      </w:r>
-      <w:proofErr w:type="spellStart"/>
-      <w:r>
-        <w:t>propostas</w:t>
-      </w:r>
-      <w:proofErr w:type="spellEnd"/>
-      <w:r>
-        <w:t xml:space="preserve"> de 2025 e de </w:t>
-      </w:r>
-      <w:proofErr w:type="spellStart"/>
-      <w:r>
-        <w:t>projetos</w:t>
-      </w:r>
-      <w:proofErr w:type="spellEnd"/>
-      <w:r>
-        <w:t xml:space="preserve"> de lei, </w:t>
-      </w:r>
-      <w:proofErr w:type="spellStart"/>
-      <w:r>
-        <w:t>além</w:t>
-      </w:r>
-      <w:proofErr w:type="spellEnd"/>
-      <w:r>
-        <w:t xml:space="preserve"> do </w:t>
-      </w:r>
-      <w:proofErr w:type="spellStart"/>
-      <w:r>
-        <w:t>destaque</w:t>
-      </w:r>
-      <w:proofErr w:type="spellEnd"/>
-      <w:r>
-        <w:t xml:space="preserve"> dos </w:t>
-      </w:r>
-      <w:proofErr w:type="spellStart"/>
-      <w:r>
-        <w:t>rótulos</w:t>
-      </w:r>
-      <w:proofErr w:type="spellEnd"/>
-      <w:r>
-        <w:t xml:space="preserve"> Meio </w:t>
-      </w:r>
-      <w:proofErr w:type="spellStart"/>
-      <w:r>
-        <w:t>ambiente</w:t>
-      </w:r>
-      <w:proofErr w:type="spellEnd"/>
-      <w:r>
-        <w:t xml:space="preserve"> e Energia. O TF-IDF </w:t>
-      </w:r>
-      <w:proofErr w:type="spellStart"/>
-      <w:r>
-        <w:t>complementa</w:t>
-      </w:r>
-      <w:proofErr w:type="spellEnd"/>
-      <w:r>
-        <w:t xml:space="preserve"> </w:t>
-      </w:r>
-      <w:proofErr w:type="spellStart"/>
-      <w:r>
-        <w:t>essa</w:t>
-      </w:r>
-      <w:proofErr w:type="spellEnd"/>
-      <w:r>
-        <w:t xml:space="preserve"> </w:t>
-      </w:r>
-      <w:proofErr w:type="spellStart"/>
-      <w:r>
-        <w:t>leitura</w:t>
-      </w:r>
-      <w:proofErr w:type="spellEnd"/>
-      <w:r>
-        <w:t xml:space="preserve"> </w:t>
-      </w:r>
-      <w:proofErr w:type="spellStart"/>
-      <w:r>
-        <w:t>ao</w:t>
-      </w:r>
-      <w:proofErr w:type="spellEnd"/>
-      <w:r>
-        <w:t xml:space="preserve"> </w:t>
-      </w:r>
-      <w:proofErr w:type="spellStart"/>
-      <w:r>
-        <w:t>destacar</w:t>
-      </w:r>
-      <w:proofErr w:type="spellEnd"/>
-      <w:r>
-        <w:t xml:space="preserve"> </w:t>
-      </w:r>
-      <w:proofErr w:type="spellStart"/>
-      <w:r>
-        <w:t>inteligência</w:t>
-      </w:r>
-      <w:proofErr w:type="spellEnd"/>
-      <w:r>
-        <w:t xml:space="preserve"> artificial, </w:t>
-      </w:r>
-      <w:proofErr w:type="spellStart"/>
-      <w:r>
-        <w:t>tecnologia</w:t>
-      </w:r>
-      <w:proofErr w:type="spellEnd"/>
-      <w:r>
-        <w:t xml:space="preserve"> e </w:t>
-      </w:r>
-      <w:proofErr w:type="spellStart"/>
-      <w:r>
-        <w:t>sustentabilidade</w:t>
-      </w:r>
-      <w:proofErr w:type="spellEnd"/>
-      <w:r>
-        <w:t xml:space="preserve"> no </w:t>
-      </w:r>
-      <w:proofErr w:type="spellStart"/>
-      <w:r>
-        <w:t>vocabulário</w:t>
-      </w:r>
-      <w:proofErr w:type="spellEnd"/>
-      <w:r>
-        <w:t xml:space="preserve"> </w:t>
-      </w:r>
-      <w:proofErr w:type="spellStart"/>
-      <w:r>
-        <w:t>escolhido</w:t>
-      </w:r>
-      <w:proofErr w:type="spellEnd"/>
-      <w:r>
-        <w:t xml:space="preserve">. </w:t>
-      </w:r>
-      <w:proofErr w:type="gramStart"/>
-      <w:r>
-        <w:t>A</w:t>
-      </w:r>
-      <w:proofErr w:type="gramEnd"/>
-      <w:r>
-        <w:t xml:space="preserve"> </w:t>
-      </w:r>
-      <w:proofErr w:type="spellStart"/>
-      <w:r>
-        <w:t>ocorrência</w:t>
-      </w:r>
-      <w:proofErr w:type="spellEnd"/>
-      <w:r>
-        <w:t xml:space="preserve"> de </w:t>
-      </w:r>
-      <w:proofErr w:type="spellStart"/>
-      <w:r>
-        <w:t>água</w:t>
-      </w:r>
-      <w:proofErr w:type="spellEnd"/>
-      <w:r>
-        <w:t xml:space="preserve"> </w:t>
-      </w:r>
-      <w:proofErr w:type="spellStart"/>
-      <w:r>
-        <w:t>em</w:t>
-      </w:r>
-      <w:proofErr w:type="spellEnd"/>
-      <w:r>
-        <w:t xml:space="preserve"> </w:t>
-      </w:r>
-      <w:proofErr w:type="spellStart"/>
-      <w:r>
-        <w:t>marca</w:t>
-      </w:r>
-      <w:proofErr w:type="spellEnd"/>
-      <w:r>
-        <w:t xml:space="preserve"> </w:t>
-      </w:r>
-      <w:proofErr w:type="spellStart"/>
-      <w:r>
-        <w:t>d’água</w:t>
-      </w:r>
-      <w:proofErr w:type="spellEnd"/>
-      <w:r>
-        <w:t xml:space="preserve"> </w:t>
-      </w:r>
-      <w:proofErr w:type="spellStart"/>
-      <w:r>
-        <w:t>mostra</w:t>
-      </w:r>
-      <w:proofErr w:type="spellEnd"/>
-      <w:r>
-        <w:t xml:space="preserve"> </w:t>
-      </w:r>
-      <w:proofErr w:type="spellStart"/>
-      <w:r>
-        <w:t>por</w:t>
-      </w:r>
-      <w:proofErr w:type="spellEnd"/>
-      <w:r>
-        <w:t xml:space="preserve"> </w:t>
-      </w:r>
-      <w:proofErr w:type="spellStart"/>
-      <w:r>
-        <w:t>que</w:t>
-      </w:r>
-      <w:proofErr w:type="spellEnd"/>
-      <w:r>
-        <w:t xml:space="preserve"> </w:t>
-      </w:r>
-      <w:proofErr w:type="spellStart"/>
-      <w:r>
-        <w:t>os</w:t>
-      </w:r>
-      <w:proofErr w:type="spellEnd"/>
-      <w:r>
-        <w:t xml:space="preserve"> pesos e as </w:t>
-      </w:r>
-      <w:proofErr w:type="spellStart"/>
-      <w:r>
-        <w:t>palavras-chave</w:t>
-      </w:r>
-      <w:proofErr w:type="spellEnd"/>
-      <w:r>
-        <w:t xml:space="preserve"> </w:t>
-      </w:r>
-      <w:proofErr w:type="spellStart"/>
-      <w:r>
-        <w:t>precisam</w:t>
-      </w:r>
-      <w:proofErr w:type="spellEnd"/>
-      <w:r>
-        <w:t xml:space="preserve"> ser </w:t>
-      </w:r>
-      <w:proofErr w:type="spellStart"/>
-      <w:r>
-        <w:t>interpretados</w:t>
-      </w:r>
-      <w:proofErr w:type="spellEnd"/>
-      <w:r>
-        <w:t xml:space="preserve"> no </w:t>
-      </w:r>
-      <w:proofErr w:type="spellStart"/>
-      <w:r>
-        <w:t>contexto</w:t>
-      </w:r>
-      <w:proofErr w:type="spellEnd"/>
-      <w:r>
-        <w:t xml:space="preserve">. Assim, o conjunto </w:t>
-      </w:r>
-      <w:proofErr w:type="spellStart"/>
-      <w:r>
-        <w:t>não</w:t>
-      </w:r>
-      <w:proofErr w:type="spellEnd"/>
-      <w:r>
-        <w:t xml:space="preserve"> </w:t>
-      </w:r>
-      <w:proofErr w:type="spellStart"/>
-      <w:r>
-        <w:t>oferece</w:t>
-      </w:r>
-      <w:proofErr w:type="spellEnd"/>
-      <w:r>
-        <w:t xml:space="preserve"> </w:t>
-      </w:r>
-      <w:proofErr w:type="spellStart"/>
-      <w:r>
-        <w:t>evidência</w:t>
-      </w:r>
-      <w:proofErr w:type="spellEnd"/>
-      <w:r>
-        <w:t xml:space="preserve"> de </w:t>
-      </w:r>
-      <w:proofErr w:type="spellStart"/>
-      <w:r>
-        <w:t>abordagem</w:t>
-      </w:r>
-      <w:proofErr w:type="spellEnd"/>
-      <w:r>
-        <w:t xml:space="preserve"> </w:t>
-      </w:r>
-      <w:proofErr w:type="spellStart"/>
-      <w:r>
-        <w:t>direta</w:t>
-      </w:r>
-      <w:proofErr w:type="spellEnd"/>
-      <w:r>
-        <w:t xml:space="preserve"> do </w:t>
-      </w:r>
-      <w:proofErr w:type="spellStart"/>
-      <w:r>
-        <w:t>consumo</w:t>
-      </w:r>
-      <w:proofErr w:type="spellEnd"/>
-      <w:r>
-        <w:t xml:space="preserve"> </w:t>
-      </w:r>
-      <w:proofErr w:type="spellStart"/>
-      <w:r>
-        <w:t>hídrico</w:t>
-      </w:r>
-      <w:proofErr w:type="spellEnd"/>
-      <w:r>
-        <w:t xml:space="preserve"> </w:t>
-      </w:r>
-      <w:proofErr w:type="spellStart"/>
-      <w:r>
-        <w:t>nas</w:t>
-      </w:r>
-      <w:proofErr w:type="spellEnd"/>
-      <w:r>
-        <w:t xml:space="preserve"> </w:t>
-      </w:r>
-      <w:proofErr w:type="spellStart"/>
-      <w:r>
-        <w:t>ementas</w:t>
-      </w:r>
-      <w:proofErr w:type="spellEnd"/>
-      <w:r>
-        <w:t xml:space="preserve">, mas </w:t>
-      </w:r>
-      <w:proofErr w:type="spellStart"/>
-      <w:r>
-        <w:t>essa</w:t>
-      </w:r>
-      <w:proofErr w:type="spellEnd"/>
-      <w:r>
-        <w:t xml:space="preserve"> </w:t>
-      </w:r>
-      <w:proofErr w:type="spellStart"/>
-      <w:r>
-        <w:t>ausência</w:t>
-      </w:r>
-      <w:proofErr w:type="spellEnd"/>
-      <w:r>
-        <w:t xml:space="preserve"> </w:t>
-      </w:r>
-      <w:proofErr w:type="spellStart"/>
-      <w:r>
-        <w:t>não</w:t>
-      </w:r>
-      <w:proofErr w:type="spellEnd"/>
-      <w:r>
-        <w:t xml:space="preserve"> </w:t>
-      </w:r>
-      <w:proofErr w:type="spellStart"/>
-      <w:r>
-        <w:t>permite</w:t>
-      </w:r>
-      <w:proofErr w:type="spellEnd"/>
-      <w:r>
-        <w:t xml:space="preserve"> </w:t>
-      </w:r>
-      <w:proofErr w:type="spellStart"/>
-      <w:r>
-        <w:t>concluir</w:t>
-      </w:r>
-      <w:proofErr w:type="spellEnd"/>
-      <w:r>
-        <w:t xml:space="preserve"> </w:t>
-      </w:r>
-      <w:proofErr w:type="spellStart"/>
-      <w:r>
-        <w:t>que</w:t>
-      </w:r>
-      <w:proofErr w:type="spellEnd"/>
-      <w:r>
-        <w:t xml:space="preserve"> o </w:t>
-      </w:r>
-      <w:proofErr w:type="spellStart"/>
-      <w:r>
-        <w:t>tema</w:t>
-      </w:r>
-      <w:proofErr w:type="spellEnd"/>
-      <w:r>
-        <w:t xml:space="preserve"> </w:t>
-      </w:r>
-      <w:proofErr w:type="spellStart"/>
-      <w:r>
-        <w:t>esteja</w:t>
-      </w:r>
-      <w:proofErr w:type="spellEnd"/>
-      <w:r>
-        <w:t xml:space="preserve"> </w:t>
-      </w:r>
-      <w:proofErr w:type="spellStart"/>
-      <w:r>
-        <w:t>ausente</w:t>
-      </w:r>
-      <w:proofErr w:type="spellEnd"/>
-      <w:r>
-        <w:t xml:space="preserve"> de </w:t>
-      </w:r>
-      <w:proofErr w:type="spellStart"/>
-      <w:r>
-        <w:t>todo</w:t>
-      </w:r>
-      <w:proofErr w:type="spellEnd"/>
-      <w:r>
-        <w:t xml:space="preserve"> o debate </w:t>
-      </w:r>
-      <w:proofErr w:type="spellStart"/>
-      <w:r>
-        <w:t>legislativo</w:t>
-      </w:r>
-      <w:proofErr w:type="spellEnd"/>
-      <w:r>
-        <w:t>.</w:t>
+      <w:r>
+        <w:t>Nas cinco propostas analisadas, duas tratam diretamente de questões ambientais ligadas aos data centers, como eficiência energética, sustentabilidade e licenciamento. Outras duas relacionam tecnologia à proteção ambiental ou ao financiamento de iniciativas ambientais e tecnológicas. Uma trata de marca d’água em conteúdos de IA e não tem relação ambiental. Os temas mais frequentes nas classificações foram Meio ambiente e Energia. No TF-IDF, os termos de maior destaque foram inteligência artificial, tecnologia e sustentabilidade. Nenhuma das cinco ementas trata diretamente do consumo de água por data centers. Isso vale para este conjunto e não significa que o assunto esteja ausente de outras propostas.</w:t>
       </w:r>
     </w:p>
     <w:p>

</xml_diff>

<commit_message>
Alterando informação nos documentos
</commit_message>
<xml_diff>
--- a/docs/Relatorio_NetLab_Charles_Mendes.docx
+++ b/docs/Relatorio_NetLab_Charles_Mendes.docx
@@ -2829,11 +2829,267 @@
       </w:hyperlink>
     </w:p>
     <w:p>
-      <w:r>
+      <w:pPr>
         <w:rPr>
           <w:sz w:val="18"/>
         </w:rPr>
-        <w:t>https://colab.research.google.com/drive/1Fms8a918A7ZIzj1D3MTcFme5DnHElREB?usp=sharing</w:t>
+      </w:pPr>
+      <w:hyperlink r:id="rId9" w:history="1">
+        <w:r>
+          <w:rPr>
+            <w:rStyle w:val="Hyperlink"/>
+            <w:sz w:val="18"/>
+          </w:rPr>
+          <w:t>https://colab.research.google.com/drive/1Fms8a918A7ZIzj1D3MTcFme5DnHElREB?usp=sharing</w:t>
+        </w:r>
+      </w:hyperlink>
+    </w:p>
+    <w:p>
+      <w:pPr>
+        <w:rPr>
+          <w:b/>
+          <w:bCs/>
+          <w:i/>
+          <w:iCs/>
+        </w:rPr>
+      </w:pPr>
+      <w:r>
+        <w:rPr>
+          <w:b/>
+          <w:bCs/>
+          <w:i/>
+          <w:iCs/>
+        </w:rPr>
+        <w:t xml:space="preserve">* Para </w:t>
+      </w:r>
+      <w:proofErr w:type="spellStart"/>
+      <w:r>
+        <w:rPr>
+          <w:b/>
+          <w:bCs/>
+          <w:i/>
+          <w:iCs/>
+        </w:rPr>
+        <w:t>executar</w:t>
+      </w:r>
+      <w:proofErr w:type="spellEnd"/>
+      <w:r>
+        <w:rPr>
+          <w:b/>
+          <w:bCs/>
+          <w:i/>
+          <w:iCs/>
+        </w:rPr>
+        <w:t xml:space="preserve"> o notebook no Google Colab </w:t>
+      </w:r>
+      <w:proofErr w:type="spellStart"/>
+      <w:r>
+        <w:rPr>
+          <w:b/>
+          <w:bCs/>
+          <w:i/>
+          <w:iCs/>
+        </w:rPr>
+        <w:t>será</w:t>
+      </w:r>
+      <w:proofErr w:type="spellEnd"/>
+      <w:r>
+        <w:rPr>
+          <w:b/>
+          <w:bCs/>
+          <w:i/>
+          <w:iCs/>
+        </w:rPr>
+        <w:t xml:space="preserve"> </w:t>
+      </w:r>
+      <w:proofErr w:type="spellStart"/>
+      <w:r>
+        <w:rPr>
+          <w:b/>
+          <w:bCs/>
+          <w:i/>
+          <w:iCs/>
+        </w:rPr>
+        <w:t>necessário</w:t>
+      </w:r>
+      <w:proofErr w:type="spellEnd"/>
+      <w:r>
+        <w:rPr>
+          <w:b/>
+          <w:bCs/>
+          <w:i/>
+          <w:iCs/>
+        </w:rPr>
+        <w:t xml:space="preserve"> </w:t>
+      </w:r>
+      <w:proofErr w:type="spellStart"/>
+      <w:r>
+        <w:rPr>
+          <w:b/>
+          <w:bCs/>
+          <w:i/>
+          <w:iCs/>
+        </w:rPr>
+        <w:t>uma</w:t>
+      </w:r>
+      <w:proofErr w:type="spellEnd"/>
+      <w:r>
+        <w:rPr>
+          <w:b/>
+          <w:bCs/>
+          <w:i/>
+          <w:iCs/>
+        </w:rPr>
+        <w:t xml:space="preserve"> </w:t>
+      </w:r>
+      <w:proofErr w:type="spellStart"/>
+      <w:r>
+        <w:rPr>
+          <w:b/>
+          <w:bCs/>
+          <w:i/>
+          <w:iCs/>
+        </w:rPr>
+        <w:t>chave</w:t>
+      </w:r>
+      <w:proofErr w:type="spellEnd"/>
+      <w:r>
+        <w:rPr>
+          <w:b/>
+          <w:bCs/>
+          <w:i/>
+          <w:iCs/>
+        </w:rPr>
+        <w:t xml:space="preserve"> de API da OpenAI</w:t>
+      </w:r>
+      <w:r>
+        <w:rPr>
+          <w:b/>
+          <w:bCs/>
+          <w:i/>
+          <w:iCs/>
+        </w:rPr>
+        <w:t xml:space="preserve">, </w:t>
+      </w:r>
+      <w:proofErr w:type="spellStart"/>
+      <w:r>
+        <w:rPr>
+          <w:b/>
+          <w:bCs/>
+          <w:i/>
+          <w:iCs/>
+        </w:rPr>
+        <w:t>posso</w:t>
+      </w:r>
+      <w:proofErr w:type="spellEnd"/>
+      <w:r>
+        <w:rPr>
+          <w:b/>
+          <w:bCs/>
+          <w:i/>
+          <w:iCs/>
+        </w:rPr>
+        <w:t xml:space="preserve"> </w:t>
+      </w:r>
+      <w:proofErr w:type="spellStart"/>
+      <w:r>
+        <w:rPr>
+          <w:b/>
+          <w:bCs/>
+          <w:i/>
+          <w:iCs/>
+        </w:rPr>
+        <w:t>disponibilizar</w:t>
+      </w:r>
+      <w:proofErr w:type="spellEnd"/>
+      <w:r>
+        <w:rPr>
+          <w:b/>
+          <w:bCs/>
+          <w:i/>
+          <w:iCs/>
+        </w:rPr>
+        <w:t xml:space="preserve"> a </w:t>
+      </w:r>
+      <w:proofErr w:type="spellStart"/>
+      <w:r>
+        <w:rPr>
+          <w:b/>
+          <w:bCs/>
+          <w:i/>
+          <w:iCs/>
+        </w:rPr>
+        <w:t>mesma</w:t>
+      </w:r>
+      <w:proofErr w:type="spellEnd"/>
+      <w:r>
+        <w:rPr>
+          <w:b/>
+          <w:bCs/>
+          <w:i/>
+          <w:iCs/>
+        </w:rPr>
+        <w:t xml:space="preserve"> </w:t>
+      </w:r>
+      <w:proofErr w:type="spellStart"/>
+      <w:r>
+        <w:rPr>
+          <w:b/>
+          <w:bCs/>
+          <w:i/>
+          <w:iCs/>
+        </w:rPr>
+        <w:t>caso</w:t>
+      </w:r>
+      <w:proofErr w:type="spellEnd"/>
+      <w:r>
+        <w:rPr>
+          <w:b/>
+          <w:bCs/>
+          <w:i/>
+          <w:iCs/>
+        </w:rPr>
+        <w:t xml:space="preserve"> </w:t>
+      </w:r>
+      <w:proofErr w:type="spellStart"/>
+      <w:r>
+        <w:rPr>
+          <w:b/>
+          <w:bCs/>
+          <w:i/>
+          <w:iCs/>
+        </w:rPr>
+        <w:t>seja</w:t>
+      </w:r>
+      <w:proofErr w:type="spellEnd"/>
+      <w:r>
+        <w:rPr>
+          <w:b/>
+          <w:bCs/>
+          <w:i/>
+          <w:iCs/>
+        </w:rPr>
+        <w:t xml:space="preserve"> </w:t>
+      </w:r>
+      <w:proofErr w:type="spellStart"/>
+      <w:r>
+        <w:rPr>
+          <w:b/>
+          <w:bCs/>
+          <w:i/>
+          <w:iCs/>
+        </w:rPr>
+        <w:t>necessário</w:t>
+      </w:r>
+      <w:proofErr w:type="spellEnd"/>
+      <w:r>
+        <w:rPr>
+          <w:b/>
+          <w:bCs/>
+          <w:i/>
+          <w:iCs/>
+        </w:rPr>
+        <w:t>.</w:t>
       </w:r>
     </w:p>
     <w:p>
@@ -5159,7 +5415,7 @@
       <w:pPr>
         <w:spacing w:after="40"/>
       </w:pPr>
-      <w:hyperlink r:id="rId9">
+      <w:hyperlink r:id="rId10">
         <w:r>
           <w:rPr>
             <w:color w:val="0563C1"/>
@@ -5205,7 +5461,7 @@
       <w:pPr>
         <w:spacing w:after="40"/>
       </w:pPr>
-      <w:hyperlink r:id="rId10">
+      <w:hyperlink r:id="rId11">
         <w:r>
           <w:rPr>
             <w:color w:val="0563C1"/>
@@ -5251,7 +5507,7 @@
       <w:pPr>
         <w:spacing w:after="40"/>
       </w:pPr>
-      <w:hyperlink r:id="rId11">
+      <w:hyperlink r:id="rId12">
         <w:r>
           <w:rPr>
             <w:color w:val="0563C1"/>
@@ -5297,7 +5553,7 @@
       <w:pPr>
         <w:spacing w:after="40"/>
       </w:pPr>
-      <w:hyperlink r:id="rId12">
+      <w:hyperlink r:id="rId13">
         <w:r>
           <w:rPr>
             <w:color w:val="0563C1"/>
@@ -5343,7 +5599,7 @@
       <w:pPr>
         <w:spacing w:after="40"/>
       </w:pPr>
-      <w:hyperlink r:id="rId13">
+      <w:hyperlink r:id="rId14">
         <w:r>
           <w:rPr>
             <w:color w:val="0563C1"/>
@@ -5458,7 +5714,7 @@
                           <pic:cNvPicPr/>
                         </pic:nvPicPr>
                         <pic:blipFill>
-                          <a:blip r:embed="rId14"/>
+                          <a:blip r:embed="rId15"/>
                           <a:stretch>
                             <a:fillRect/>
                           </a:stretch>
@@ -5624,7 +5880,7 @@
                           <pic:cNvPicPr/>
                         </pic:nvPicPr>
                         <pic:blipFill>
-                          <a:blip r:embed="rId15"/>
+                          <a:blip r:embed="rId16"/>
                           <a:stretch>
                             <a:fillRect/>
                           </a:stretch>
@@ -5883,7 +6139,7 @@
                           <pic:cNvPicPr/>
                         </pic:nvPicPr>
                         <pic:blipFill>
-                          <a:blip r:embed="rId16"/>
+                          <a:blip r:embed="rId17"/>
                           <a:stretch>
                             <a:fillRect/>
                           </a:stretch>
@@ -6366,8 +6622,8 @@
       </w:r>
     </w:p>
     <w:sectPr>
-      <w:headerReference w:type="default" r:id="rId17"/>
-      <w:footerReference w:type="default" r:id="rId18"/>
+      <w:headerReference w:type="default" r:id="rId18"/>
+      <w:footerReference w:type="default" r:id="rId19"/>
       <w:pgSz w:w="11906" w:h="16838"/>
       <w:pgMar w:top="1020" w:right="1134" w:bottom="1020" w:left="1134" w:header="454" w:footer="454" w:gutter="0"/>
       <w:cols w:space="720"/>

</xml_diff>